<commit_message>
Align experiment 3 report with implementation
</commit_message>
<xml_diff>
--- a/output/doc/实验3_三维模型显示_实验报告_李富悦.docx
+++ b/output/doc/实验3_三维模型显示_实验报告_李富悦.docx
@@ -398,19 +398,18 @@
     </w:p>
     <w:p>
       <w:pPr>
-        <w:tabs>
-          <w:tab w:pos="8280" w:val="right" w:leader="dot"/>
-        </w:tabs>
-        <w:ind w:left="840"/>
-      </w:pPr>
-      <w:r>
-        <w:rPr>
-          <w:rFonts w:ascii="Times New Roman" w:hAnsi="Times New Roman" w:eastAsia="宋体"/>
-          <w:sz w:val="24"/>
+        <w:pStyle w:val="heading 1"/>
+        <w:spacing w:before="160" w:after="120"/>
+        <w:ind w:left="0" w:firstLine="0"/>
+        <w:jc w:val="center"/>
+      </w:pPr>
+      <w:r>
+        <w:rPr>
+          <w:rFonts w:ascii="Times New Roman" w:hAnsi="Times New Roman" w:eastAsia="黑体"/>
+          <w:b/>
+          <w:sz w:val="30"/>
         </w:rPr>
         <w:t>一、实验目的</w:t>
-        <w:tab/>
-        <w:t>3</w:t>
       </w:r>
     </w:p>
     <w:p>
@@ -439,19 +438,18 @@
     </w:p>
     <w:p>
       <w:pPr>
-        <w:tabs>
-          <w:tab w:pos="8280" w:val="right" w:leader="dot"/>
-        </w:tabs>
-        <w:ind w:left="840"/>
-      </w:pPr>
-      <w:r>
-        <w:rPr>
-          <w:rFonts w:ascii="Times New Roman" w:hAnsi="Times New Roman" w:eastAsia="宋体"/>
-          <w:sz w:val="24"/>
+        <w:pStyle w:val="heading 1"/>
+        <w:spacing w:before="160" w:after="120"/>
+        <w:ind w:left="0" w:firstLine="0"/>
+        <w:jc w:val="center"/>
+      </w:pPr>
+      <w:r>
+        <w:rPr>
+          <w:rFonts w:ascii="Times New Roman" w:hAnsi="Times New Roman" w:eastAsia="黑体"/>
+          <w:b/>
+          <w:sz w:val="30"/>
         </w:rPr>
         <w:t>二、实验要求分析</w:t>
-        <w:tab/>
-        <w:t>3</w:t>
       </w:r>
     </w:p>
     <w:p>
@@ -861,19 +859,18 @@
     </w:p>
     <w:p>
       <w:pPr>
-        <w:tabs>
-          <w:tab w:pos="8280" w:val="right" w:leader="dot"/>
-        </w:tabs>
-        <w:ind w:left="840"/>
-      </w:pPr>
-      <w:r>
-        <w:rPr>
-          <w:rFonts w:ascii="Times New Roman" w:hAnsi="Times New Roman" w:eastAsia="宋体"/>
-          <w:sz w:val="24"/>
+        <w:pStyle w:val="heading 1"/>
+        <w:spacing w:before="160" w:after="120"/>
+        <w:ind w:left="0" w:firstLine="0"/>
+        <w:jc w:val="center"/>
+      </w:pPr>
+      <w:r>
+        <w:rPr>
+          <w:rFonts w:ascii="Times New Roman" w:hAnsi="Times New Roman" w:eastAsia="黑体"/>
+          <w:b/>
+          <w:sz w:val="30"/>
         </w:rPr>
         <w:t>三、实验环境与模型数据</w:t>
-        <w:tab/>
-        <w:t>3</w:t>
       </w:r>
     </w:p>
     <w:p>
@@ -1345,19 +1342,18 @@
     </w:p>
     <w:p>
       <w:pPr>
-        <w:tabs>
-          <w:tab w:pos="8280" w:val="right" w:leader="dot"/>
-        </w:tabs>
-        <w:ind w:left="840"/>
-      </w:pPr>
-      <w:r>
-        <w:rPr>
-          <w:rFonts w:ascii="Times New Roman" w:hAnsi="Times New Roman" w:eastAsia="宋体"/>
-          <w:sz w:val="24"/>
+        <w:pStyle w:val="heading 1"/>
+        <w:spacing w:before="160" w:after="120"/>
+        <w:ind w:left="0" w:firstLine="0"/>
+        <w:jc w:val="center"/>
+      </w:pPr>
+      <w:r>
+        <w:rPr>
+          <w:rFonts w:ascii="Times New Roman" w:hAnsi="Times New Roman" w:eastAsia="黑体"/>
+          <w:b/>
+          <w:sz w:val="30"/>
         </w:rPr>
         <w:t>四、Task1：PLY 模型读取与纯色显示</w:t>
-        <w:tab/>
-        <w:t>4</w:t>
       </w:r>
     </w:p>
     <w:p>
@@ -1819,19 +1815,18 @@
     </w:p>
     <w:p>
       <w:pPr>
-        <w:tabs>
-          <w:tab w:pos="8280" w:val="right" w:leader="dot"/>
-        </w:tabs>
-        <w:ind w:left="840"/>
-      </w:pPr>
-      <w:r>
-        <w:rPr>
-          <w:rFonts w:ascii="Times New Roman" w:hAnsi="Times New Roman" w:eastAsia="宋体"/>
-          <w:sz w:val="24"/>
+        <w:pStyle w:val="heading 1"/>
+        <w:spacing w:before="160" w:after="120"/>
+        <w:ind w:left="0" w:firstLine="0"/>
+        <w:jc w:val="center"/>
+      </w:pPr>
+      <w:r>
+        <w:rPr>
+          <w:rFonts w:ascii="Times New Roman" w:hAnsi="Times New Roman" w:eastAsia="黑体"/>
+          <w:b/>
+          <w:sz w:val="30"/>
         </w:rPr>
         <w:t>五、附加题1：光照小人与光源旋转动画</w:t>
-        <w:tab/>
-        <w:t>5</w:t>
       </w:r>
     </w:p>
     <w:p>
@@ -2281,19 +2276,18 @@
     </w:p>
     <w:p>
       <w:pPr>
-        <w:tabs>
-          <w:tab w:pos="8280" w:val="right" w:leader="dot"/>
-        </w:tabs>
-        <w:ind w:left="840"/>
-      </w:pPr>
-      <w:r>
-        <w:rPr>
-          <w:rFonts w:ascii="Times New Roman" w:hAnsi="Times New Roman" w:eastAsia="宋体"/>
-          <w:sz w:val="24"/>
+        <w:pStyle w:val="heading 1"/>
+        <w:spacing w:before="160" w:after="120"/>
+        <w:ind w:left="0" w:firstLine="0"/>
+        <w:jc w:val="center"/>
+      </w:pPr>
+      <w:r>
+        <w:rPr>
+          <w:rFonts w:ascii="Times New Roman" w:hAnsi="Times New Roman" w:eastAsia="黑体"/>
+          <w:b/>
+          <w:sz w:val="30"/>
         </w:rPr>
         <w:t>六、附加题2：旋转立方体明暗计算</w:t>
-        <w:tab/>
-        <w:t>7</w:t>
       </w:r>
     </w:p>
     <w:p>
@@ -2909,14 +2903,15 @@
     </w:p>
     <w:p>
       <w:pPr>
-        <w:spacing w:after="120" w:line="300" w:lineRule="auto"/>
+        <w:spacing w:line="300" w:lineRule="auto"/>
         <w:ind w:firstLine="440"/>
       </w:pPr>
       <w:r>
         <w:rPr>
           <w:rFonts w:ascii="Times New Roman" w:hAnsi="Times New Roman" w:eastAsia="宋体"/>
-        </w:rPr>
-        <w:t>滑动条用于连续调节光照和材质参数，例如环境光强度、漫反射强度、镜面反射强度、光泽度和光源位置。相比只用键盘切换固定值，滑动条可以更直观地观察参数变化对明暗计算的影响。</w:t>
+          <w:sz w:val="22"/>
+        </w:rPr>
+        <w:t>滑动条用于连续调节光照和材质参数，源码中设置了 Ambient、Diffuse、Specular 和 Shininess 四个滑动条，分别控制环境光系数、漫反射系数、镜面反射系数和光泽度。光源位置由程序根据角度变量自动绕模型旋转，键盘 o/p 负责切换白色光和彩色光。相比只用键盘切换固定值，滑动条可以更直观地观察参数变化对明暗计算的影响。</w:t>
       </w:r>
     </w:p>
     <w:p>
@@ -3194,19 +3189,18 @@
     </w:p>
     <w:p>
       <w:pPr>
-        <w:tabs>
-          <w:tab w:pos="8280" w:val="right" w:leader="dot"/>
-        </w:tabs>
-        <w:ind w:left="840"/>
-      </w:pPr>
-      <w:r>
-        <w:rPr>
-          <w:rFonts w:ascii="Times New Roman" w:hAnsi="Times New Roman" w:eastAsia="宋体"/>
-          <w:sz w:val="24"/>
+        <w:pStyle w:val="heading 1"/>
+        <w:spacing w:before="160" w:after="120"/>
+        <w:ind w:left="0" w:firstLine="0"/>
+        <w:jc w:val="center"/>
+      </w:pPr>
+      <w:r>
+        <w:rPr>
+          <w:rFonts w:ascii="Times New Roman" w:hAnsi="Times New Roman" w:eastAsia="黑体"/>
+          <w:b/>
+          <w:sz w:val="30"/>
         </w:rPr>
         <w:t>七、问题处理与结果分析</w:t>
-        <w:tab/>
-        <w:t>9</w:t>
       </w:r>
     </w:p>
     <w:p>
@@ -3259,19 +3253,18 @@
     </w:p>
     <w:p>
       <w:pPr>
-        <w:tabs>
-          <w:tab w:pos="8280" w:val="right" w:leader="dot"/>
-        </w:tabs>
-        <w:ind w:left="840"/>
-      </w:pPr>
-      <w:r>
-        <w:rPr>
-          <w:rFonts w:ascii="Times New Roman" w:hAnsi="Times New Roman" w:eastAsia="宋体"/>
-          <w:sz w:val="24"/>
+        <w:pStyle w:val="heading 1"/>
+        <w:spacing w:before="160" w:after="120"/>
+        <w:ind w:left="0" w:firstLine="0"/>
+        <w:jc w:val="center"/>
+      </w:pPr>
+      <w:r>
+        <w:rPr>
+          <w:rFonts w:ascii="Times New Roman" w:hAnsi="Times New Roman" w:eastAsia="黑体"/>
+          <w:b/>
+          <w:sz w:val="30"/>
         </w:rPr>
         <w:t>八、实验总结</w:t>
-        <w:tab/>
-        <w:t>9</w:t>
       </w:r>
     </w:p>
     <w:p>

</xml_diff>